<commit_message>
The Arana clause comes off the Colliers unknown; the audio settled it as the Surrey arena
Co-Authored-By: Claude Fable 5.1 <noreply@anthropic.com>
Claude-Session: https://claude.ai/code/session_01J55941tRFE1tGX63LJBUVG
</commit_message>
<xml_diff>
--- a/docs/BD-Vancouver-Updates-Synopsis-2026-09-03.docx
+++ b/docs/BD-Vancouver-Updates-Synopsis-2026-09-03.docx
@@ -195,7 +195,7 @@
     </w:p>
     <w:p>
       <w:r>
-        <w:pict w14:anchorId="75D61B75">
+        <w:pict w14:anchorId="66438D38">
           <v:rect id="_x0000_i1025" style="width:0;height:1.5pt" o:hralign="center" o:hrstd="t" o:hr="t"/>
         </w:pict>
       </w:r>
@@ -4766,7 +4766,7 @@
         <w:t>Omar’s Colliers contact:</w:t>
       </w:r>
       <w:r>
-        <w:t xml:space="preserve"> her name, and whether she is at Colliers Project Leaders (#70132) or Colliers International (#5096). Also the owner body for BC Cancer that sounded like “Arana” at 0:03 — PHSA?</w:t>
+        <w:t xml:space="preserve"> her name, and whether she is at Colliers Project Leaders (#70132) or Colliers International (#5096).</w:t>
       </w:r>
     </w:p>
     <w:p>
@@ -4795,10 +4795,7 @@
         <w:t>Ike</w:t>
       </w:r>
       <w:r>
-        <w:t xml:space="preserve">, Rory’s contact who did the “bonus” </w:t>
-      </w:r>
-      <w:r>
-        <w:t xml:space="preserve">job; there is no Ike or Isaac among the 87 Vancouver staff on record, so it may be a nickname. And whether the principal JM remembers is </w:t>
+        <w:t xml:space="preserve">, Rory’s contact who did the “bonus” job; there is no Ike or Isaac among the 87 Vancouver staff on record, so it may be a nickname. And whether the principal JM remembers is </w:t>
       </w:r>
       <w:r>
         <w:rPr>
@@ -4827,7 +4824,10 @@
         <w:t>JB’s Bosa names:</w:t>
       </w:r>
       <w:r>
-        <w:t xml:space="preserve"> confirm Robert is Robert Bosa (founder of Bosa Properties, Colin’s father) and Dale is Dale Bosa (Colin’s brother).</w:t>
+        <w:t xml:space="preserve"> </w:t>
+      </w:r>
+      <w:r>
+        <w:t>confirm Robert is Robert Bosa (founder of Bosa Properties, Colin’s father) and Dale is Dale Bosa (Colin’s brother).</w:t>
       </w:r>
     </w:p>
     <w:p>
@@ -4875,10 +4875,7 @@
         <w:t>“the turn”</w:t>
       </w:r>
       <w:r>
-        <w:t xml:space="preserve"> </w:t>
-      </w:r>
-      <w:r>
-        <w:t>(Islam, undecided): project or client names. Two re-listens could not recover the first; the second is said clearly as “the turn”.</w:t>
+        <w:t xml:space="preserve"> (Islam, undecided): project or client names. Two re-listens could not recover the first; the second is said clearly as “the turn”.</w:t>
       </w:r>
     </w:p>
     <w:p>
@@ -4935,10 +4932,10 @@
         <w:t>BAM:</w:t>
       </w:r>
       <w:r>
-        <w:t xml:space="preserve"> Jim clearly says “a new development group called BAM”</w:t>
-      </w:r>
-      <w:r>
-        <w:t>, but nothing under that name can be found, and the only Ben Smith in BC real estate on record is a proptech executive with no Starlight history, so not him. Jim has his number. Trillium is Trillium Communities (#54443): head office Victoria, seniors’ communities across the Island and the Lower Mainland, which matches “Trillium has a lot of property”. “Sue” survives two re-listens but is not on Trillium’s leadership page; either a person there or a slurred “who”.</w:t>
+        <w:t xml:space="preserve"> Jim clearly says “a new development group called BAM”, but nothing under that name can be found, and the only Ben Smith in BC real estate on record is a proptech executive with no Starlight history, so not him. Jim has his number. Trillium is Trillium Communities (#54443): head office Victoria, seniors’ communities across the Island and the Lower Mainland, which matches “Trillium has a lot of property”. “Sue” </w:t>
+      </w:r>
+      <w:r>
+        <w:t>survives two re-listens but is not on Trillium’s leadership page; either a person there or a slurred “who”.</w:t>
       </w:r>
     </w:p>
     <w:p>
@@ -4957,10 +4954,7 @@
         <w:t>Continuum:</w:t>
       </w:r>
       <w:r>
-        <w:t xml:space="preserve"> </w:t>
-      </w:r>
-      <w:r>
-        <w:t>whether Ben Smith’s second name was Gregory Eeman (Architect AIBC) or someone else. The partners are Beintema and Wiens; Kapuscinski has left; Peter Fair is Denver and is not to be contacted.</w:t>
+        <w:t xml:space="preserve"> whether Ben Smith’s second name was Gregory Eeman (Architect AIBC) or someone else. The partners are Beintema and Wiens; Kapuscinski has left; Peter Fair is Denver and is not to be contacted.</w:t>
       </w:r>
     </w:p>
     <w:p>
@@ -4968,10 +4962,10 @@
         <w:pStyle w:val="FirstParagraph"/>
       </w:pPr>
       <w:r>
-        <w:t xml:space="preserve">Closed since the first draft: Heather Lands. Jim’s words are “GBL is doing three of the blocks, we’re working on Block B, they also have Block A and Block C” and “from my understanding, Wiki Meverhurst [WHM] has both of those jobs.” </w:t>
-      </w:r>
-      <w:r>
-        <w:t>Which building is Block B, and WHM’s hold on A and C, are Jim’s own knowledge, not questions for the room. (Public record, for the file: GBL’s Parcel B at 620 West 35th is three towers of 24, 20 and 12 storeys, 612 homes; the 25/18/6-storey set is Parcel F, RH Architects.) The Fraser Mills teams are JM’s action item 9, not an unknown. The Fraser Health list is Omar’s (item 12). Jason and Kevin are Jason Stuart and Kevin Wurmlinger.</w:t>
+        <w:t xml:space="preserve">Closed since the first draft: Heather Lands. Jim’s words are “GBL is doing three of the blocks, we’re working on Block B, they also have Block A and Block C” and </w:t>
+      </w:r>
+      <w:r>
+        <w:t>“from my understanding, Wiki Meverhurst [WHM] has both of those jobs.” Which building is Block B, and WHM’s hold on A and C, are Jim’s own knowledge, not questions for the room. (Public record, for the file: GBL’s Parcel B at 620 West 35th is three towers of 24, 20 and 12 storeys, 612 homes; the 25/18/6-storey set is Parcel F, RH Architects.) The Fraser Mills teams are JM’s action item 9, not an unknown. The Fraser Health list is Omar’s (item 12). Jason and Kevin are Jason Stuart and Kevin Wurmlinger.</w:t>
       </w:r>
     </w:p>
     <w:p>
@@ -7686,7 +7680,14 @@
                 <w:rFonts w:ascii="Segoe UI" w:hAnsi="Segoe UI" w:cs="Segoe UI"/>
                 <w:sz w:val="17"/>
               </w:rPr>
-              <w:t>“arena”: a Surrey arena Colliers is bidding to be owner’s rep on</w:t>
+              <w:t>“arena”</w:t>
+            </w:r>
+            <w:r>
+              <w:rPr>
+                <w:rFonts w:ascii="Segoe UI" w:hAnsi="Segoe UI" w:cs="Segoe UI"/>
+                <w:sz w:val="17"/>
+              </w:rPr>
+              <w:t>: a Surrey arena Colliers is bidding to be owner’s rep on</w:t>
             </w:r>
           </w:p>
         </w:tc>
@@ -11701,10 +11702,7 @@
         <w:t>NDY</w:t>
       </w:r>
       <w:r>
-        <w:t xml:space="preserve"> </w:t>
-      </w:r>
-      <w:r>
-        <w:t xml:space="preserve">(not in the brain; the new </w:t>
+        <w:t xml:space="preserve"> (not in the brain; the new </w:t>
       </w:r>
       <w:r>
         <w:rPr>
@@ -11713,7 +11711,10 @@
         <w:t>--create</w:t>
       </w:r>
       <w:r>
-        <w:t xml:space="preserve"> verb failed on its first real use with a SQL memory-grant error, see the duplicate-sweep notes); Omar’s office-to-hotel client and the Coal Harbour hotel developer (firms not named); the San Diego wood-frame RFP client (not named); the K-12 seismic list (a qualification, not a pursuit).</w:t>
+        <w:t xml:space="preserve"> verb failed on its first real use with a SQL memory-grant error, see the duplicate-sweep notes); Omar’s office-to-hotel client and the </w:t>
+      </w:r>
+      <w:r>
+        <w:t>Coal Harbour hotel developer (firms not named); the San Diego wood-frame RFP client (not named); the K-12 seismic list (a qualification, not a pursuit).</w:t>
       </w:r>
       <w:bookmarkEnd w:id="0"/>
       <w:bookmarkEnd w:id="7"/>
@@ -11974,7 +11975,7 @@
   <w:abstractNum w:abstractNumId="0" w15:restartNumberingAfterBreak="0">
     <w:nsid w:val="0000A990"/>
     <w:multiLevelType w:val="multilevel"/>
-    <w:tmpl w:val="94C4A2B6"/>
+    <w:tmpl w:val="2F8EC6CA"/>
     <w:lvl w:ilvl="0">
       <w:numFmt w:val="bullet"/>
       <w:lvlText w:val=" "/>
@@ -12051,7 +12052,7 @@
   <w:abstractNum w:abstractNumId="1" w15:restartNumberingAfterBreak="0">
     <w:nsid w:val="0000A991"/>
     <w:multiLevelType w:val="multilevel"/>
-    <w:tmpl w:val="66485DA8"/>
+    <w:tmpl w:val="7FD8F1CA"/>
     <w:lvl w:ilvl="0">
       <w:numFmt w:val="bullet"/>
       <w:lvlText w:val=""/>
@@ -12155,7 +12156,7 @@
   <w:abstractNum w:abstractNumId="2" w15:restartNumberingAfterBreak="0">
     <w:nsid w:val="00A99411"/>
     <w:multiLevelType w:val="multilevel"/>
-    <w:tmpl w:val="A3FEED86"/>
+    <w:tmpl w:val="DAF0EBC4"/>
     <w:lvl w:ilvl="0">
       <w:start w:val="1"/>
       <w:numFmt w:val="decimal"/>
@@ -12238,13 +12239,13 @@
       </w:pPr>
     </w:lvl>
   </w:abstractNum>
-  <w:num w:numId="1" w16cid:durableId="245382100">
+  <w:num w:numId="1" w16cid:durableId="1629126430">
     <w:abstractNumId w:val="0"/>
   </w:num>
-  <w:num w:numId="2" w16cid:durableId="216163237">
+  <w:num w:numId="2" w16cid:durableId="978922913">
     <w:abstractNumId w:val="1"/>
   </w:num>
-  <w:num w:numId="3" w16cid:durableId="1833175470">
+  <w:num w:numId="3" w16cid:durableId="1844779048">
     <w:abstractNumId w:val="2"/>
     <w:lvlOverride w:ilvl="0">
       <w:startOverride w:val="1"/>
@@ -12274,7 +12275,7 @@
       <w:startOverride w:val="1"/>
     </w:lvlOverride>
   </w:num>
-  <w:num w:numId="4" w16cid:durableId="1115520791">
+  <w:num w:numId="4" w16cid:durableId="277373688">
     <w:abstractNumId w:val="2"/>
     <w:lvlOverride w:ilvl="0">
       <w:startOverride w:val="1"/>
@@ -13532,7 +13533,7 @@
   <w:style w:type="table" w:styleId="TableGrid">
     <w:name w:val="Table Grid"/>
     <w:basedOn w:val="TableNormal"/>
-    <w:rsid w:val="00962331"/>
+    <w:rsid w:val="001B5CCC"/>
     <w:pPr>
       <w:spacing w:after="0"/>
     </w:pPr>
@@ -13551,7 +13552,7 @@
     <w:name w:val="header"/>
     <w:basedOn w:val="Normal"/>
     <w:link w:val="HeaderChar"/>
-    <w:rsid w:val="00962331"/>
+    <w:rsid w:val="001B5CCC"/>
     <w:pPr>
       <w:tabs>
         <w:tab w:val="center" w:pos="4680"/>
@@ -13564,7 +13565,7 @@
     <w:name w:val="Header Char"/>
     <w:basedOn w:val="DefaultParagraphFont"/>
     <w:link w:val="Header"/>
-    <w:rsid w:val="00962331"/>
+    <w:rsid w:val="001B5CCC"/>
     <w:rPr>
       <w:rFonts w:ascii="Georgia" w:hAnsi="Georgia"/>
       <w:sz w:val="20"/>
@@ -13574,7 +13575,7 @@
     <w:name w:val="footer"/>
     <w:basedOn w:val="Normal"/>
     <w:link w:val="FooterChar"/>
-    <w:rsid w:val="00962331"/>
+    <w:rsid w:val="001B5CCC"/>
     <w:pPr>
       <w:tabs>
         <w:tab w:val="center" w:pos="4680"/>
@@ -13587,7 +13588,7 @@
     <w:name w:val="Footer Char"/>
     <w:basedOn w:val="DefaultParagraphFont"/>
     <w:link w:val="Footer"/>
-    <w:rsid w:val="00962331"/>
+    <w:rsid w:val="001B5CCC"/>
     <w:rPr>
       <w:rFonts w:ascii="Georgia" w:hAnsi="Georgia"/>
       <w:sz w:val="20"/>

</xml_diff>